<commit_message>
feat(QA-5687): E2E test-recepcion pendientes acuse y rechazo
Add Cucumber scenarios TC-INT-017/018 chaining POST test-recepcion,
GET pendientes-recepcion and PUT acuse-recibo (accept/reject).

Includes probe script, npm scripts for E2E and full card closure,
and updated matriz/evidencias generators.

Co-authored-by: JFCandia-Digital <JFCandia-Digital@users.noreply.github.com>
</commit_message>
<xml_diff>
--- a/docs/api-v3.5/Documento_Evidencias_Pruebas_TestRecepcion.docx
+++ b/docs/api-v3.5/Documento_Evidencias_Pruebas_TestRecepcion.docx
@@ -322,6 +322,14 @@
         <w:t>Evidencia E2E mediante correos automáticos DocDigital (ids 89721–89726).</w:t>
       </w:r>
     </w:p>
+    <w:p>
+      <w:pPr>
+        <w:pStyle w:val="ListBullet"/>
+      </w:pPr>
+      <w:r>
+        <w:t>Flujo OP receptora: POST → GET pendientes-recepcion → PUT acuse/rechazo (TC-INT-017/018).</w:t>
+      </w:r>
+    </w:p>
     <w:p/>
     <w:p>
       <w:r>
@@ -331,7 +339,7 @@
         <w:t xml:space="preserve">Fuera de alcance en esta iteración: </w:t>
       </w:r>
       <w:r>
-        <w:t>TC-INT-010 a 015 (validaciones GET detalle/archivo/trazabilidad) y TC-INT-017/018 (E2E acuse/rechazo automatizado).</w:t>
+        <w:t>TC-INT-010 a 015 (validaciones GET detalle/archivo/trazabilidad).</w:t>
       </w:r>
     </w:p>
     <w:p>
@@ -587,7 +595,7 @@
               <w:rPr>
                 <w:b/>
               </w:rPr>
-              <w:t>Comando suite</w:t>
+              <w:t>Comando suite POST</w:t>
             </w:r>
           </w:p>
         </w:tc>
@@ -598,6 +606,56 @@
           <w:p>
             <w:r>
               <w:t>npm run test_recepcion_report</w:t>
+            </w:r>
+          </w:p>
+        </w:tc>
+      </w:tr>
+      <w:tr>
+        <w:tc>
+          <w:tcPr>
+            <w:tcW w:type="dxa" w:w="4320"/>
+          </w:tcPr>
+          <w:p>
+            <w:r>
+              <w:rPr>
+                <w:b/>
+              </w:rPr>
+              <w:t>Comando suite E2E OP</w:t>
+            </w:r>
+          </w:p>
+        </w:tc>
+        <w:tc>
+          <w:tcPr>
+            <w:tcW w:type="dxa" w:w="4320"/>
+          </w:tcPr>
+          <w:p>
+            <w:r>
+              <w:t>npm run test_recepcion_e2e_report</w:t>
+            </w:r>
+          </w:p>
+        </w:tc>
+      </w:tr>
+      <w:tr>
+        <w:tc>
+          <w:tcPr>
+            <w:tcW w:type="dxa" w:w="4320"/>
+          </w:tcPr>
+          <w:p>
+            <w:r>
+              <w:rPr>
+                <w:b/>
+              </w:rPr>
+              <w:t>Comando cierre QA-5687</w:t>
+            </w:r>
+          </w:p>
+        </w:tc>
+        <w:tc>
+          <w:tcPr>
+            <w:tcW w:type="dxa" w:w="4320"/>
+          </w:tcPr>
+          <w:p>
+            <w:r>
+              <w:t>npm run test_recepcion_cierre_report</w:t>
             </w:r>
           </w:p>
         </w:tc>
@@ -2725,7 +2783,7 @@
               <w:rPr>
                 <w:sz w:val="14"/>
               </w:rPr>
-              <w:t>Pendiente — iteración 2</w:t>
+              <w:t>Pendiente ejecución E2E — npm run test_recepcion_e2e</w:t>
             </w:r>
           </w:p>
         </w:tc>
@@ -2819,7 +2877,7 @@
               <w:rPr>
                 <w:sz w:val="14"/>
               </w:rPr>
-              <w:t>Pendiente — iteración 2</w:t>
+              <w:t>Pendiente ejecución E2E — npm run test_recepcion_e2e</w:t>
             </w:r>
           </w:p>
         </w:tc>

</xml_diff>